<commit_message>
just added two lines to how to run
</commit_message>
<xml_diff>
--- a/how to run application.docx
+++ b/how to run application.docx
@@ -28,6 +28,65 @@
           <w:szCs w:val="44"/>
         </w:rPr>
         <w:t xml:space="preserve"> backend:</w:t>
+      </w:r>
+    </w:p>
+    <w:p>
+      <w:pPr>
+        <w:rPr>
+          <w:b/>
+          <w:bCs/>
+          <w:sz w:val="28"/>
+          <w:szCs w:val="28"/>
+        </w:rPr>
+      </w:pPr>
+      <w:r>
+        <w:rPr>
+          <w:b/>
+          <w:bCs/>
+          <w:sz w:val="28"/>
+          <w:szCs w:val="28"/>
+        </w:rPr>
+        <w:t>*</w:t>
+      </w:r>
+      <w:proofErr w:type="gramStart"/>
+      <w:r>
+        <w:rPr>
+          <w:b/>
+          <w:bCs/>
+          <w:sz w:val="28"/>
+          <w:szCs w:val="28"/>
+        </w:rPr>
+        <w:t>you</w:t>
+      </w:r>
+      <w:proofErr w:type="gramEnd"/>
+      <w:r>
+        <w:rPr>
+          <w:b/>
+          <w:bCs/>
+          <w:sz w:val="28"/>
+          <w:szCs w:val="28"/>
+        </w:rPr>
+        <w:t xml:space="preserve"> will need to install </w:t>
+      </w:r>
+      <w:proofErr w:type="spellStart"/>
+      <w:r>
+        <w:rPr>
+          <w:b/>
+          <w:bCs/>
+          <w:sz w:val="28"/>
+          <w:szCs w:val="28"/>
+        </w:rPr>
+        <w:t>nodejs</w:t>
+      </w:r>
+      <w:proofErr w:type="spellEnd"/>
+      <w:r>
+        <w:rPr>
+          <w:b/>
+          <w:bCs/>
+          <w:sz w:val="28"/>
+          <w:szCs w:val="28"/>
+        </w:rPr>
+        <w:t xml:space="preserve"> prior</w:t>
       </w:r>
     </w:p>
     <w:p>
@@ -327,6 +386,93 @@
         </w:rPr>
         <w:t>Back in the terminal write “node index.js”</w:t>
       </w:r>
+    </w:p>
+    <w:p>
+      <w:pPr>
+        <w:pStyle w:val="ListParagraph"/>
+        <w:rPr>
+          <w:b/>
+          <w:bCs/>
+          <w:sz w:val="28"/>
+          <w:szCs w:val="28"/>
+        </w:rPr>
+      </w:pPr>
+      <w:r>
+        <w:rPr>
+          <w:b/>
+          <w:bCs/>
+          <w:sz w:val="28"/>
+          <w:szCs w:val="28"/>
+        </w:rPr>
+        <w:t>*</w:t>
+      </w:r>
+      <w:proofErr w:type="gramStart"/>
+      <w:r>
+        <w:rPr>
+          <w:b/>
+          <w:bCs/>
+          <w:sz w:val="28"/>
+          <w:szCs w:val="28"/>
+        </w:rPr>
+        <w:t>you</w:t>
+      </w:r>
+      <w:proofErr w:type="gramEnd"/>
+      <w:r>
+        <w:rPr>
+          <w:b/>
+          <w:bCs/>
+          <w:sz w:val="28"/>
+          <w:szCs w:val="28"/>
+        </w:rPr>
+        <w:t xml:space="preserve"> can </w:t>
+      </w:r>
+      <w:r>
+        <w:rPr>
+          <w:b/>
+          <w:bCs/>
+          <w:sz w:val="28"/>
+          <w:szCs w:val="28"/>
+        </w:rPr>
+        <w:t xml:space="preserve">run </w:t>
+      </w:r>
+      <w:proofErr w:type="gramStart"/>
+      <w:r>
+        <w:rPr>
+          <w:b/>
+          <w:bCs/>
+          <w:sz w:val="28"/>
+          <w:szCs w:val="28"/>
+        </w:rPr>
+        <w:t>‘ node</w:t>
+      </w:r>
+      <w:proofErr w:type="gramEnd"/>
+      <w:r>
+        <w:rPr>
+          <w:b/>
+          <w:bCs/>
+          <w:sz w:val="28"/>
+          <w:szCs w:val="28"/>
+        </w:rPr>
+        <w:t xml:space="preserve"> reset-database.js’</w:t>
+      </w:r>
+      <w:r>
+        <w:rPr>
+          <w:b/>
+          <w:bCs/>
+          <w:sz w:val="28"/>
+          <w:szCs w:val="28"/>
+        </w:rPr>
+        <w:t xml:space="preserve"> then ‘node index.js’ to reset the database</w:t>
+      </w:r>
+    </w:p>
+    <w:p>
+      <w:pPr>
+        <w:pStyle w:val="ListParagraph"/>
+        <w:rPr>
+          <w:sz w:val="32"/>
+          <w:szCs w:val="32"/>
+        </w:rPr>
+      </w:pPr>
     </w:p>
     <w:p>
       <w:pPr>
@@ -787,6 +933,14 @@
         <w:t>Open the website and the app is ready!</w:t>
       </w:r>
     </w:p>
+    <w:p>
+      <w:pPr>
+        <w:rPr>
+          <w:sz w:val="28"/>
+          <w:szCs w:val="28"/>
+        </w:rPr>
+      </w:pPr>
+    </w:p>
     <w:sectPr>
       <w:pgSz w:w="12240" w:h="15840"/>
       <w:pgMar w:top="1440" w:right="1440" w:bottom="1440" w:left="1440" w:header="708" w:footer="708" w:gutter="0"/>
@@ -889,6 +1043,232 @@
     </w:lvl>
   </w:abstractNum>
   <w:abstractNum w:abstractNumId="1" w15:restartNumberingAfterBreak="0">
+    <w:nsid w:val="223C0136"/>
+    <w:multiLevelType w:val="hybridMultilevel"/>
+    <w:tmpl w:val="E070DCFE"/>
+    <w:lvl w:ilvl="0" w:tplc="30685E94">
+      <w:start w:val="4"/>
+      <w:numFmt w:val="bullet"/>
+      <w:lvlText w:val=""/>
+      <w:lvlJc w:val="left"/>
+      <w:pPr>
+        <w:ind w:left="720" w:hanging="360"/>
+      </w:pPr>
+      <w:rPr>
+        <w:rFonts w:ascii="Symbol" w:eastAsiaTheme="minorHAnsi" w:hAnsi="Symbol" w:cstheme="minorBidi" w:hint="default"/>
+      </w:rPr>
+    </w:lvl>
+    <w:lvl w:ilvl="1" w:tplc="04090003" w:tentative="1">
+      <w:start w:val="1"/>
+      <w:numFmt w:val="bullet"/>
+      <w:lvlText w:val="o"/>
+      <w:lvlJc w:val="left"/>
+      <w:pPr>
+        <w:ind w:left="1440" w:hanging="360"/>
+      </w:pPr>
+      <w:rPr>
+        <w:rFonts w:ascii="Courier New" w:hAnsi="Courier New" w:cs="Courier New" w:hint="default"/>
+      </w:rPr>
+    </w:lvl>
+    <w:lvl w:ilvl="2" w:tplc="04090005" w:tentative="1">
+      <w:start w:val="1"/>
+      <w:numFmt w:val="bullet"/>
+      <w:lvlText w:val=""/>
+      <w:lvlJc w:val="left"/>
+      <w:pPr>
+        <w:ind w:left="2160" w:hanging="360"/>
+      </w:pPr>
+      <w:rPr>
+        <w:rFonts w:ascii="Wingdings" w:hAnsi="Wingdings" w:hint="default"/>
+      </w:rPr>
+    </w:lvl>
+    <w:lvl w:ilvl="3" w:tplc="04090001" w:tentative="1">
+      <w:start w:val="1"/>
+      <w:numFmt w:val="bullet"/>
+      <w:lvlText w:val=""/>
+      <w:lvlJc w:val="left"/>
+      <w:pPr>
+        <w:ind w:left="2880" w:hanging="360"/>
+      </w:pPr>
+      <w:rPr>
+        <w:rFonts w:ascii="Symbol" w:hAnsi="Symbol" w:hint="default"/>
+      </w:rPr>
+    </w:lvl>
+    <w:lvl w:ilvl="4" w:tplc="04090003" w:tentative="1">
+      <w:start w:val="1"/>
+      <w:numFmt w:val="bullet"/>
+      <w:lvlText w:val="o"/>
+      <w:lvlJc w:val="left"/>
+      <w:pPr>
+        <w:ind w:left="3600" w:hanging="360"/>
+      </w:pPr>
+      <w:rPr>
+        <w:rFonts w:ascii="Courier New" w:hAnsi="Courier New" w:cs="Courier New" w:hint="default"/>
+      </w:rPr>
+    </w:lvl>
+    <w:lvl w:ilvl="5" w:tplc="04090005" w:tentative="1">
+      <w:start w:val="1"/>
+      <w:numFmt w:val="bullet"/>
+      <w:lvlText w:val=""/>
+      <w:lvlJc w:val="left"/>
+      <w:pPr>
+        <w:ind w:left="4320" w:hanging="360"/>
+      </w:pPr>
+      <w:rPr>
+        <w:rFonts w:ascii="Wingdings" w:hAnsi="Wingdings" w:hint="default"/>
+      </w:rPr>
+    </w:lvl>
+    <w:lvl w:ilvl="6" w:tplc="04090001" w:tentative="1">
+      <w:start w:val="1"/>
+      <w:numFmt w:val="bullet"/>
+      <w:lvlText w:val=""/>
+      <w:lvlJc w:val="left"/>
+      <w:pPr>
+        <w:ind w:left="5040" w:hanging="360"/>
+      </w:pPr>
+      <w:rPr>
+        <w:rFonts w:ascii="Symbol" w:hAnsi="Symbol" w:hint="default"/>
+      </w:rPr>
+    </w:lvl>
+    <w:lvl w:ilvl="7" w:tplc="04090003" w:tentative="1">
+      <w:start w:val="1"/>
+      <w:numFmt w:val="bullet"/>
+      <w:lvlText w:val="o"/>
+      <w:lvlJc w:val="left"/>
+      <w:pPr>
+        <w:ind w:left="5760" w:hanging="360"/>
+      </w:pPr>
+      <w:rPr>
+        <w:rFonts w:ascii="Courier New" w:hAnsi="Courier New" w:cs="Courier New" w:hint="default"/>
+      </w:rPr>
+    </w:lvl>
+    <w:lvl w:ilvl="8" w:tplc="04090005" w:tentative="1">
+      <w:start w:val="1"/>
+      <w:numFmt w:val="bullet"/>
+      <w:lvlText w:val=""/>
+      <w:lvlJc w:val="left"/>
+      <w:pPr>
+        <w:ind w:left="6480" w:hanging="360"/>
+      </w:pPr>
+      <w:rPr>
+        <w:rFonts w:ascii="Wingdings" w:hAnsi="Wingdings" w:hint="default"/>
+      </w:rPr>
+    </w:lvl>
+  </w:abstractNum>
+  <w:abstractNum w:abstractNumId="2" w15:restartNumberingAfterBreak="0">
+    <w:nsid w:val="28FD3EFE"/>
+    <w:multiLevelType w:val="hybridMultilevel"/>
+    <w:tmpl w:val="E23EE12E"/>
+    <w:lvl w:ilvl="0" w:tplc="D5BC122E">
+      <w:start w:val="4"/>
+      <w:numFmt w:val="bullet"/>
+      <w:lvlText w:val=""/>
+      <w:lvlJc w:val="left"/>
+      <w:pPr>
+        <w:ind w:left="1080" w:hanging="360"/>
+      </w:pPr>
+      <w:rPr>
+        <w:rFonts w:ascii="Symbol" w:eastAsiaTheme="minorHAnsi" w:hAnsi="Symbol" w:cstheme="minorBidi" w:hint="default"/>
+      </w:rPr>
+    </w:lvl>
+    <w:lvl w:ilvl="1" w:tplc="04090003" w:tentative="1">
+      <w:start w:val="1"/>
+      <w:numFmt w:val="bullet"/>
+      <w:lvlText w:val="o"/>
+      <w:lvlJc w:val="left"/>
+      <w:pPr>
+        <w:ind w:left="1800" w:hanging="360"/>
+      </w:pPr>
+      <w:rPr>
+        <w:rFonts w:ascii="Courier New" w:hAnsi="Courier New" w:cs="Courier New" w:hint="default"/>
+      </w:rPr>
+    </w:lvl>
+    <w:lvl w:ilvl="2" w:tplc="04090005" w:tentative="1">
+      <w:start w:val="1"/>
+      <w:numFmt w:val="bullet"/>
+      <w:lvlText w:val=""/>
+      <w:lvlJc w:val="left"/>
+      <w:pPr>
+        <w:ind w:left="2520" w:hanging="360"/>
+      </w:pPr>
+      <w:rPr>
+        <w:rFonts w:ascii="Wingdings" w:hAnsi="Wingdings" w:hint="default"/>
+      </w:rPr>
+    </w:lvl>
+    <w:lvl w:ilvl="3" w:tplc="04090001" w:tentative="1">
+      <w:start w:val="1"/>
+      <w:numFmt w:val="bullet"/>
+      <w:lvlText w:val=""/>
+      <w:lvlJc w:val="left"/>
+      <w:pPr>
+        <w:ind w:left="3240" w:hanging="360"/>
+      </w:pPr>
+      <w:rPr>
+        <w:rFonts w:ascii="Symbol" w:hAnsi="Symbol" w:hint="default"/>
+      </w:rPr>
+    </w:lvl>
+    <w:lvl w:ilvl="4" w:tplc="04090003" w:tentative="1">
+      <w:start w:val="1"/>
+      <w:numFmt w:val="bullet"/>
+      <w:lvlText w:val="o"/>
+      <w:lvlJc w:val="left"/>
+      <w:pPr>
+        <w:ind w:left="3960" w:hanging="360"/>
+      </w:pPr>
+      <w:rPr>
+        <w:rFonts w:ascii="Courier New" w:hAnsi="Courier New" w:cs="Courier New" w:hint="default"/>
+      </w:rPr>
+    </w:lvl>
+    <w:lvl w:ilvl="5" w:tplc="04090005" w:tentative="1">
+      <w:start w:val="1"/>
+      <w:numFmt w:val="bullet"/>
+      <w:lvlText w:val=""/>
+      <w:lvlJc w:val="left"/>
+      <w:pPr>
+        <w:ind w:left="4680" w:hanging="360"/>
+      </w:pPr>
+      <w:rPr>
+        <w:rFonts w:ascii="Wingdings" w:hAnsi="Wingdings" w:hint="default"/>
+      </w:rPr>
+    </w:lvl>
+    <w:lvl w:ilvl="6" w:tplc="04090001" w:tentative="1">
+      <w:start w:val="1"/>
+      <w:numFmt w:val="bullet"/>
+      <w:lvlText w:val=""/>
+      <w:lvlJc w:val="left"/>
+      <w:pPr>
+        <w:ind w:left="5400" w:hanging="360"/>
+      </w:pPr>
+      <w:rPr>
+        <w:rFonts w:ascii="Symbol" w:hAnsi="Symbol" w:hint="default"/>
+      </w:rPr>
+    </w:lvl>
+    <w:lvl w:ilvl="7" w:tplc="04090003" w:tentative="1">
+      <w:start w:val="1"/>
+      <w:numFmt w:val="bullet"/>
+      <w:lvlText w:val="o"/>
+      <w:lvlJc w:val="left"/>
+      <w:pPr>
+        <w:ind w:left="6120" w:hanging="360"/>
+      </w:pPr>
+      <w:rPr>
+        <w:rFonts w:ascii="Courier New" w:hAnsi="Courier New" w:cs="Courier New" w:hint="default"/>
+      </w:rPr>
+    </w:lvl>
+    <w:lvl w:ilvl="8" w:tplc="04090005" w:tentative="1">
+      <w:start w:val="1"/>
+      <w:numFmt w:val="bullet"/>
+      <w:lvlText w:val=""/>
+      <w:lvlJc w:val="left"/>
+      <w:pPr>
+        <w:ind w:left="6840" w:hanging="360"/>
+      </w:pPr>
+      <w:rPr>
+        <w:rFonts w:ascii="Wingdings" w:hAnsi="Wingdings" w:hint="default"/>
+      </w:rPr>
+    </w:lvl>
+  </w:abstractNum>
+  <w:abstractNum w:abstractNumId="3" w15:restartNumberingAfterBreak="0">
     <w:nsid w:val="301E2479"/>
     <w:multiLevelType w:val="hybridMultilevel"/>
     <w:tmpl w:val="D922B116"/>
@@ -981,7 +1361,13 @@
     <w:abstractNumId w:val="0"/>
   </w:num>
   <w:num w:numId="2" w16cid:durableId="547107520">
+    <w:abstractNumId w:val="3"/>
+  </w:num>
+  <w:num w:numId="3" w16cid:durableId="4408995">
     <w:abstractNumId w:val="1"/>
+  </w:num>
+  <w:num w:numId="4" w16cid:durableId="1950234623">
+    <w:abstractNumId w:val="2"/>
   </w:num>
 </w:numbering>
 </file>

</xml_diff>